<commit_message>
L-0530: crew_tracker names an INDEX status crew does not know
read reports a word outside LANE_FOR_STATUS as disagree "could not tell"
with the ten-word list instead of "expects None"; RETIRED_STATUSES adds a
text-only "; the crew word is <w>" hint to that note and to move's two
refusals. No lane, write or exit code comes from the hint. Docs, guide
rebuild, code map and CHANGELOG updated; sabotage entries are a tooling
follow-up (harness path).

Claude-Session: https://claude.ai/code/session_01QLY3kk7DCXpucXGu3wSniW
</commit_message>
<xml_diff>
--- a/docs/guides/crew/crew-memory-and-obsidian.docx
+++ b/docs/guides/crew/crew-memory-and-obsidian.docx
@@ -2831,6 +2831,118 @@
         </w:tc>
       </w:tr>
     </w:tbl>
+    <w:p>
+      <w:pPr>
+        <w:pStyle w:val="BodyText"/>
+        <w:bidi w:val="0"/>
+        <w:jc w:val="left"/>
+        <w:rPr/>
+      </w:pPr>
+      <w:r>
+        <w:rPr/>
+        <w:t xml:space="preserve">Any other word in an INDEX status cell maps to no lane, and crew will not guess one. Moving to it is refused, and reading the ticket says the word is not a status crew knows rather than calling the card misplaced. For a word that was retired - </w:t>
+      </w:r>
+      <w:r>
+        <w:rPr>
+          <w:rStyle w:val="SourceText"/>
+        </w:rPr>
+        <w:t>approved</w:t>
+      </w:r>
+      <w:r>
+        <w:rPr/>
+        <w:t xml:space="preserve">, </w:t>
+      </w:r>
+      <w:r>
+        <w:rPr>
+          <w:rStyle w:val="SourceText"/>
+        </w:rPr>
+        <w:t>merged</w:t>
+      </w:r>
+      <w:r>
+        <w:rPr/>
+        <w:t xml:space="preserve">, </w:t>
+      </w:r>
+      <w:r>
+        <w:rPr>
+          <w:rStyle w:val="SourceText"/>
+        </w:rPr>
+        <w:t>closed</w:t>
+      </w:r>
+      <w:r>
+        <w:rPr/>
+        <w:t xml:space="preserve">, </w:t>
+      </w:r>
+      <w:r>
+        <w:rPr>
+          <w:rStyle w:val="SourceText"/>
+        </w:rPr>
+        <w:t>new</w:t>
+      </w:r>
+      <w:r>
+        <w:rPr/>
+        <w:t xml:space="preserve">, </w:t>
+      </w:r>
+      <w:r>
+        <w:rPr>
+          <w:rStyle w:val="SourceText"/>
+        </w:rPr>
+        <w:t>parked</w:t>
+      </w:r>
+      <w:r>
+        <w:rPr/>
+        <w:t xml:space="preserve"> - it also names the word to write instead (</w:t>
+      </w:r>
+      <w:r>
+        <w:rPr>
+          <w:rStyle w:val="SourceText"/>
+        </w:rPr>
+        <w:t>spec</w:t>
+      </w:r>
+      <w:r>
+        <w:rPr/>
+        <w:t xml:space="preserve">, </w:t>
+      </w:r>
+      <w:r>
+        <w:rPr>
+          <w:rStyle w:val="SourceText"/>
+        </w:rPr>
+        <w:t>done</w:t>
+      </w:r>
+      <w:r>
+        <w:rPr/>
+        <w:t xml:space="preserve">, </w:t>
+      </w:r>
+      <w:r>
+        <w:rPr>
+          <w:rStyle w:val="SourceText"/>
+        </w:rPr>
+        <w:t>done</w:t>
+      </w:r>
+      <w:r>
+        <w:rPr/>
+        <w:t xml:space="preserve">, </w:t>
+      </w:r>
+      <w:r>
+        <w:rPr>
+          <w:rStyle w:val="SourceText"/>
+        </w:rPr>
+        <w:t>direction</w:t>
+      </w:r>
+      <w:r>
+        <w:rPr/>
+        <w:t xml:space="preserve">, </w:t>
+      </w:r>
+      <w:r>
+        <w:rPr>
+          <w:rStyle w:val="SourceText"/>
+        </w:rPr>
+        <w:t>needs-owner</w:t>
+      </w:r>
+      <w:r>
+        <w:rPr/>
+        <w:t>). Fix the INDEX cell by hand; crew never rewrites it for you.</w:t>
+      </w:r>
+    </w:p>
     <w:p>
       <w:pPr>
         <w:pStyle w:val="BodyText"/>

</xml_diff>